<commit_message>
UTS SQA: isi kelas A
</commit_message>
<xml_diff>
--- a/UTS_SQA_TIFS26_003_2123036_KurniawanArifRenggi.docx
+++ b/UTS_SQA_TIFS26_003_2123036_KurniawanArifRenggi.docx
@@ -137,11 +137,9 @@
             <w:tcW w:type="dxa" w:w="7370"/>
           </w:tcPr>
           <w:p>
-            <w:r/>
             <w:r>
-              <w:rPr>
-                <w:sz w:val="20"/>
-              </w:rPr>
+              <w:rPr/>
+              <w:t>A</w:t>
             </w:r>
           </w:p>
         </w:tc>

</xml_diff>